<commit_message>
Antes de retornar a refatoração com IA zero contexto
</commit_message>
<xml_diff>
--- a/docs/architecture/contracts/domain-review-contract.md.docx
+++ b/docs/architecture/contracts/domain-review-contract.md.docx
@@ -4389,7 +4389,7 @@
     <w:link w:val="TextosemFormataoChar"/>
     <w:uiPriority w:val="99"/>
     <w:unhideWhenUsed/>
-    <w:rsid w:val="00380188"/>
+    <w:rsid w:val="00A903A0"/>
     <w:pPr>
       <w:spacing w:after="0" w:line="240" w:lineRule="auto"/>
     </w:pPr>
@@ -4404,7 +4404,7 @@
     <w:basedOn w:val="Fontepargpadro"/>
     <w:link w:val="TextosemFormatao"/>
     <w:uiPriority w:val="99"/>
-    <w:rsid w:val="00380188"/>
+    <w:rsid w:val="00A903A0"/>
     <w:rPr>
       <w:rFonts w:ascii="Consolas" w:hAnsi="Consolas"/>
       <w:sz w:val="21"/>

</xml_diff>